<commit_message>
docs(vendor): make develop the release baseline
</commit_message>
<xml_diff>
--- a/docs/vendor-portal-implementation-plan-google-docs.docx
+++ b/docs/vendor-portal-implementation-plan-google-docs.docx
@@ -269,7 +269,7 @@
           <w:color w:val="000000"/>
           <w:sz w:val="22"/>
         </w:rPr>
-        <w:t>The remaining release scope reconciles the merged vendor history with the newer frontend architecture, upgrades Prisma 5 to Prisma 7, replaces the handwritten authentication system with Better Auth, separates users and organizations from the vendor profile, adds organization-owned portal subscriptions and member portal access, and completes release hardening. Draft, Active, and Discontinued remain explicit states for both products and versions.</w:t>
+        <w:t>The remaining release scope upgrades Prisma 5 to Prisma 7, replaces the handwritten authentication system with Better Auth, separates users and organizations from the vendor profile, adds organization-owned portal subscriptions and member portal access, and completes release hardening. Draft, Active, and Discontinued remain explicit states for both products and versions.</w:t>
       </w:r>
     </w:p>
     <w:p>
@@ -1042,7 +1042,7 @@
           <w:color w:val="000000"/>
           <w:sz w:val="22"/>
         </w:rPr>
-        <w:t xml:space="preserve">Two newer frontend architecture commits on </w:t>
+        <w:t xml:space="preserve">The remote </w:t>
       </w:r>
       <w:r>
         <w:rPr>
@@ -1052,7 +1052,7 @@
           <w:color w:val="000000"/>
           <w:sz w:val="22"/>
         </w:rPr>
-        <w:t>main</w:t>
+        <w:t>develop</w:t>
       </w:r>
       <w:r>
         <w:rPr>
@@ -1062,7 +1062,27 @@
           <w:color w:val="000000"/>
           <w:sz w:val="22"/>
         </w:rPr>
-        <w:t xml:space="preserve"> add TanStack Query, TanStack Form, shared Zod contracts, smaller feature components, a same-origin Next.js BFF, and Storybook. The final release begins by reconciling those commits with the merged vendor history. The unfinished Stage 10 worktree is preserved as evidence but is not treated as completed release work.</w:t>
+        <w:t xml:space="preserve"> branch is the authoritative implementation base for this release. Work from </w:t>
+      </w:r>
+      <w:r>
+        <w:rPr>
+          <w:rFonts w:ascii="Arial" w:hAnsi="Arial"/>
+          <w:b w:val="0"/>
+          <w:i w:val="0"/>
+          <w:color w:val="000000"/>
+          <w:sz w:val="22"/>
+        </w:rPr>
+        <w:t>main</w:t>
+      </w:r>
+      <w:r>
+        <w:rPr>
+          <w:rFonts w:ascii="Arial" w:hAnsi="Arial"/>
+          <w:b w:val="0"/>
+          <w:i w:val="0"/>
+          <w:color w:val="000000"/>
+          <w:sz w:val="22"/>
+        </w:rPr>
+        <w:t xml:space="preserve"> is intentionally excluded for now and may be evaluated separately after the Vendor Portal release. The unfinished Stage 10 worktree is preserved as evidence but is not treated as completed release work.</w:t>
       </w:r>
     </w:p>
     <w:p>
@@ -1079,64 +1099,6 @@
           <w:sz w:val="22"/>
         </w:rPr>
         <w:t>The remaining platform and release gaps are concrete:</w:t>
-      </w:r>
-    </w:p>
-    <w:p>
-      <w:pPr>
-        <w:pStyle w:val="ListBullet"/>
-        <w:keepLines/>
-        <w:spacing w:after="80" w:line="276" w:lineRule="auto"/>
-        <w:ind w:left="720" w:hanging="360"/>
-      </w:pPr>
-      <w:r>
-        <w:rPr>
-          <w:rFonts w:ascii="Arial" w:hAnsi="Arial"/>
-          <w:b w:val="0"/>
-          <w:i w:val="0"/>
-          <w:color w:val="000000"/>
-          <w:sz w:val="22"/>
-        </w:rPr>
-        <w:t xml:space="preserve">The repository has divergent </w:t>
-      </w:r>
-      <w:r>
-        <w:rPr>
-          <w:rFonts w:ascii="Courier New" w:hAnsi="Courier New"/>
-          <w:b w:val="0"/>
-          <w:i w:val="0"/>
-          <w:color w:val="000000"/>
-          <w:sz w:val="20"/>
-        </w:rPr>
-        <w:t>main</w:t>
-      </w:r>
-      <w:r>
-        <w:rPr>
-          <w:rFonts w:ascii="Arial" w:hAnsi="Arial"/>
-          <w:b w:val="0"/>
-          <w:i w:val="0"/>
-          <w:color w:val="000000"/>
-          <w:sz w:val="22"/>
-        </w:rPr>
-        <w:t xml:space="preserve"> and </w:t>
-      </w:r>
-      <w:r>
-        <w:rPr>
-          <w:rFonts w:ascii="Courier New" w:hAnsi="Courier New"/>
-          <w:b w:val="0"/>
-          <w:i w:val="0"/>
-          <w:color w:val="000000"/>
-          <w:sz w:val="20"/>
-        </w:rPr>
-        <w:t>develop</w:t>
-      </w:r>
-      <w:r>
-        <w:rPr>
-          <w:rFonts w:ascii="Arial" w:hAnsi="Arial"/>
-          <w:b w:val="0"/>
-          <w:i w:val="0"/>
-          <w:color w:val="000000"/>
-          <w:sz w:val="22"/>
-        </w:rPr>
-        <w:t xml:space="preserve"> histories that must be reconciled before further feature work.</w:t>
       </w:r>
     </w:p>
     <w:p>
@@ -5899,175 +5861,6 @@
                 <w:color w:val="000000"/>
                 <w:sz w:val="18"/>
               </w:rPr>
-              <w:t>codex/platform-vendor-branch-reconciliation</w:t>
-            </w:r>
-          </w:p>
-        </w:tc>
-        <w:tc>
-          <w:tcPr>
-            <w:tcW w:type="dxa" w:w="2550"/>
-            <w:tcMar>
-              <w:top w:w="80" w:type="dxa"/>
-              <w:start w:w="120" w:type="dxa"/>
-              <w:bottom w:w="80" w:type="dxa"/>
-              <w:end w:w="120" w:type="dxa"/>
-            </w:tcMar>
-            <w:vAlign w:val="top"/>
-          </w:tcPr>
-          <w:p>
-            <w:pPr>
-              <w:spacing w:before="0" w:after="60" w:line="252" w:lineRule="auto"/>
-            </w:pPr>
-            <w:r>
-              <w:rPr>
-                <w:rFonts w:ascii="Arial" w:hAnsi="Arial"/>
-                <w:b w:val="0"/>
-                <w:i w:val="0"/>
-                <w:color w:val="000000"/>
-                <w:sz w:val="18"/>
-              </w:rPr>
-            </w:r>
-            <w:r>
-              <w:rPr>
-                <w:rFonts w:ascii="Arial" w:hAnsi="Arial"/>
-                <w:b w:val="0"/>
-                <w:i w:val="0"/>
-                <w:color w:val="000000"/>
-                <w:sz w:val="18"/>
-              </w:rPr>
-              <w:t>chore(repo): reconcile vendor and frontend architecture branches</w:t>
-            </w:r>
-          </w:p>
-        </w:tc>
-        <w:tc>
-          <w:tcPr>
-            <w:tcW w:type="dxa" w:w="2760"/>
-            <w:tcMar>
-              <w:top w:w="80" w:type="dxa"/>
-              <w:start w:w="120" w:type="dxa"/>
-              <w:bottom w:w="80" w:type="dxa"/>
-              <w:end w:w="120" w:type="dxa"/>
-            </w:tcMar>
-            <w:vAlign w:val="top"/>
-          </w:tcPr>
-          <w:p>
-            <w:pPr>
-              <w:spacing w:before="0" w:after="60" w:line="252" w:lineRule="auto"/>
-            </w:pPr>
-            <w:r>
-              <w:rPr>
-                <w:rFonts w:ascii="Arial" w:hAnsi="Arial"/>
-                <w:b w:val="0"/>
-                <w:i w:val="0"/>
-                <w:color w:val="000000"/>
-                <w:sz w:val="18"/>
-              </w:rPr>
-            </w:r>
-            <w:r>
-              <w:rPr>
-                <w:rFonts w:ascii="Arial" w:hAnsi="Arial"/>
-                <w:b w:val="0"/>
-                <w:i w:val="0"/>
-                <w:color w:val="000000"/>
-                <w:sz w:val="18"/>
-              </w:rPr>
-              <w:t xml:space="preserve">Combine the merged vendor stages with the newer frontend architecture on one trusted </w:t>
-            </w:r>
-            <w:r>
-              <w:rPr>
-                <w:rFonts w:ascii="Arial" w:hAnsi="Arial"/>
-                <w:b w:val="0"/>
-                <w:i w:val="0"/>
-                <w:color w:val="000000"/>
-                <w:sz w:val="18"/>
-              </w:rPr>
-              <w:t>develop</w:t>
-            </w:r>
-            <w:r>
-              <w:rPr>
-                <w:rFonts w:ascii="Arial" w:hAnsi="Arial"/>
-                <w:b w:val="0"/>
-                <w:i w:val="0"/>
-                <w:color w:val="000000"/>
-                <w:sz w:val="18"/>
-              </w:rPr>
-              <w:t xml:space="preserve"> history.</w:t>
-            </w:r>
-          </w:p>
-        </w:tc>
-      </w:tr>
-      <w:tr>
-        <w:trPr>
-          <w:cantSplit w:val="true"/>
-        </w:trPr>
-        <w:tc>
-          <w:tcPr>
-            <w:tcW w:type="dxa" w:w="1500"/>
-            <w:tcMar>
-              <w:top w:w="80" w:type="dxa"/>
-              <w:start w:w="120" w:type="dxa"/>
-              <w:bottom w:w="80" w:type="dxa"/>
-              <w:end w:w="120" w:type="dxa"/>
-            </w:tcMar>
-            <w:vAlign w:val="top"/>
-          </w:tcPr>
-          <w:p>
-            <w:pPr>
-              <w:spacing w:before="0" w:after="60" w:line="252" w:lineRule="auto"/>
-            </w:pPr>
-            <w:r>
-              <w:rPr>
-                <w:rFonts w:ascii="Arial" w:hAnsi="Arial"/>
-                <w:b w:val="0"/>
-                <w:i w:val="0"/>
-                <w:color w:val="000000"/>
-                <w:sz w:val="18"/>
-              </w:rPr>
-            </w:r>
-            <w:r>
-              <w:rPr>
-                <w:rFonts w:ascii="Arial" w:hAnsi="Arial"/>
-                <w:b w:val="0"/>
-                <w:i w:val="0"/>
-                <w:color w:val="000000"/>
-                <w:sz w:val="18"/>
-              </w:rPr>
-              <w:t>02</w:t>
-            </w:r>
-          </w:p>
-        </w:tc>
-        <w:tc>
-          <w:tcPr>
-            <w:tcW w:type="dxa" w:w="2550"/>
-            <w:tcMar>
-              <w:top w:w="80" w:type="dxa"/>
-              <w:start w:w="120" w:type="dxa"/>
-              <w:bottom w:w="80" w:type="dxa"/>
-              <w:end w:w="120" w:type="dxa"/>
-            </w:tcMar>
-            <w:vAlign w:val="top"/>
-          </w:tcPr>
-          <w:p>
-            <w:pPr>
-              <w:spacing w:before="0" w:after="60" w:line="252" w:lineRule="auto"/>
-            </w:pPr>
-            <w:r>
-              <w:rPr>
-                <w:rFonts w:ascii="Arial" w:hAnsi="Arial"/>
-                <w:b w:val="0"/>
-                <w:i w:val="0"/>
-                <w:color w:val="000000"/>
-                <w:sz w:val="18"/>
-              </w:rPr>
-            </w:r>
-            <w:r>
-              <w:rPr>
-                <w:rFonts w:ascii="Arial" w:hAnsi="Arial"/>
-                <w:b w:val="0"/>
-                <w:i w:val="0"/>
-                <w:color w:val="000000"/>
-                <w:sz w:val="18"/>
-              </w:rPr>
               <w:t>codex/backend-vendor-prisma-7</w:t>
             </w:r>
           </w:p>
@@ -6181,7 +5974,7 @@
                 <w:color w:val="000000"/>
                 <w:sz w:val="18"/>
               </w:rPr>
-              <w:t>03</w:t>
+              <w:t>02</w:t>
             </w:r>
           </w:p>
         </w:tc>
@@ -6330,7 +6123,7 @@
                 <w:color w:val="000000"/>
                 <w:sz w:val="18"/>
               </w:rPr>
-              <w:t>04</w:t>
+              <w:t>03</w:t>
             </w:r>
           </w:p>
         </w:tc>
@@ -6479,7 +6272,7 @@
                 <w:color w:val="000000"/>
                 <w:sz w:val="18"/>
               </w:rPr>
-              <w:t>05</w:t>
+              <w:t>04</w:t>
             </w:r>
           </w:p>
         </w:tc>
@@ -6628,7 +6421,7 @@
                 <w:color w:val="000000"/>
                 <w:sz w:val="18"/>
               </w:rPr>
-              <w:t>06</w:t>
+              <w:t>05</w:t>
             </w:r>
           </w:p>
         </w:tc>
@@ -6777,7 +6570,7 @@
                 <w:color w:val="000000"/>
                 <w:sz w:val="18"/>
               </w:rPr>
-              <w:t>07</w:t>
+              <w:t>06</w:t>
             </w:r>
           </w:p>
         </w:tc>
@@ -6926,7 +6719,7 @@
                 <w:color w:val="000000"/>
                 <w:sz w:val="18"/>
               </w:rPr>
-              <w:t>08</w:t>
+              <w:t>07</w:t>
             </w:r>
           </w:p>
         </w:tc>
@@ -7075,7 +6868,7 @@
                 <w:color w:val="000000"/>
                 <w:sz w:val="18"/>
               </w:rPr>
-              <w:t>09</w:t>
+              <w:t>08</w:t>
             </w:r>
           </w:p>
         </w:tc>
@@ -7224,7 +7017,7 @@
                 <w:color w:val="000000"/>
                 <w:sz w:val="18"/>
               </w:rPr>
-              <w:t>10</w:t>
+              <w:t>09</w:t>
             </w:r>
           </w:p>
         </w:tc>
@@ -7373,7 +7166,7 @@
                 <w:color w:val="000000"/>
                 <w:sz w:val="18"/>
               </w:rPr>
-              <w:t>11</w:t>
+              <w:t>10</w:t>
             </w:r>
           </w:p>
         </w:tc>
@@ -7522,7 +7315,7 @@
                 <w:color w:val="000000"/>
                 <w:sz w:val="18"/>
               </w:rPr>
-              <w:t>12</w:t>
+              <w:t>11</w:t>
             </w:r>
           </w:p>
         </w:tc>
@@ -7671,7 +7464,7 @@
                 <w:color w:val="000000"/>
                 <w:sz w:val="18"/>
               </w:rPr>
-              <w:t>13</w:t>
+              <w:t>12</w:t>
             </w:r>
           </w:p>
         </w:tc>
@@ -7818,8 +7611,14 @@
           <w:color w:val="000000"/>
           <w:sz w:val="22"/>
         </w:rPr>
-        <w:t xml:space="preserve">PR 01 preserves the unfinished Stage 10 changes on a local safety commit, begins from remote </w:t>
-      </w:r>
+        <w:t>PR 01 upgrades Prisma without changing user-visible behavior. It verifies clean and current-data migrations, generation, seeding, API tests, pooling, and shutdown behavior.</w:t>
+      </w:r>
+    </w:p>
+    <w:p>
+      <w:pPr>
+        <w:keepLines/>
+        <w:spacing w:before="0" w:after="160" w:line="276" w:lineRule="auto"/>
+      </w:pPr>
       <w:r>
         <w:rPr>
           <w:rFonts w:ascii="Arial" w:hAnsi="Arial"/>
@@ -7828,8 +7627,14 @@
           <w:color w:val="000000"/>
           <w:sz w:val="22"/>
         </w:rPr>
-        <w:t>develop</w:t>
-      </w:r>
+        <w:t>PR 02 adds Better Auth's User, Account, Session, Verification, Organization, Member, and Invitation data, email/password flows, verification, reset, TOTP, recovery codes, session revocation, legacy-password migration, and the temporary compatibility facade.</w:t>
+      </w:r>
+    </w:p>
+    <w:p>
+      <w:pPr>
+        <w:keepLines/>
+        <w:spacing w:before="0" w:after="160" w:line="276" w:lineRule="auto"/>
+      </w:pPr>
       <w:r>
         <w:rPr>
           <w:rFonts w:ascii="Arial" w:hAnsi="Arial"/>
@@ -7838,8 +7643,14 @@
           <w:color w:val="000000"/>
           <w:sz w:val="22"/>
         </w:rPr>
-        <w:t xml:space="preserve">, integrates the two newer </w:t>
-      </w:r>
+        <w:t>PR 03 adds Portal, Organization Portal Subscription, Member Portal Access, primary Vendor Profile, subscription/access middleware, catalog ownership backfill, one-primary-profile enforcement, and migration verification reports.</w:t>
+      </w:r>
+    </w:p>
+    <w:p>
+      <w:pPr>
+        <w:keepLines/>
+        <w:spacing w:before="0" w:after="160" w:line="276" w:lineRule="auto"/>
+      </w:pPr>
       <w:r>
         <w:rPr>
           <w:rFonts w:ascii="Arial" w:hAnsi="Arial"/>
@@ -7848,8 +7659,14 @@
           <w:color w:val="000000"/>
           <w:sz w:val="22"/>
         </w:rPr>
-        <w:t>main</w:t>
-      </w:r>
+        <w:t>PRs 04 and 05 separately deliver the visible authentication/onboarding and member-access experiences. The Organization switcher appears only when a User has multiple memberships. Custom job roles remain deferred.</w:t>
+      </w:r>
+    </w:p>
+    <w:p>
+      <w:pPr>
+        <w:keepLines/>
+        <w:spacing w:before="0" w:after="160" w:line="276" w:lineRule="auto"/>
+      </w:pPr>
       <w:r>
         <w:rPr>
           <w:rFonts w:ascii="Arial" w:hAnsi="Arial"/>
@@ -7858,7 +7675,7 @@
           <w:color w:val="000000"/>
           <w:sz w:val="22"/>
         </w:rPr>
-        <w:t xml:space="preserve"> commits, and resolves conflicts in favor of the newer TanStack/Form/Zod/BFF/Storybook architecture while retaining stages 00 through 09.</w:t>
+        <w:t>PR 06 completes profile-scoped authorization across products, versions, categories, templates, and lifecycle actions, including system-record immutability, identifier uniqueness, and primary-version concurrency.</w:t>
       </w:r>
     </w:p>
     <w:p>
@@ -7874,7 +7691,7 @@
           <w:color w:val="000000"/>
           <w:sz w:val="22"/>
         </w:rPr>
-        <w:t>PR 02 upgrades Prisma without changing user-visible behavior. It verifies clean and current-data migrations, generation, seeding, API tests, pooling, and shutdown behavior.</w:t>
+        <w:t>PR 07 completes R2 upload/deletion/rollback tests, version-owned media behavior, CSV limits and row errors, profile-aware import/export, and universal-search isolation and the 10,000-product benchmark.</w:t>
       </w:r>
     </w:p>
     <w:p>
@@ -7890,7 +7707,7 @@
           <w:color w:val="000000"/>
           <w:sz w:val="22"/>
         </w:rPr>
-        <w:t>PR 03 adds Better Auth's User, Account, Session, Verification, Organization, Member, and Invitation data, email/password flows, verification, reset, TOTP, recovery codes, session revocation, legacy-password migration, and the temporary compatibility facade.</w:t>
+        <w:t>PR 08 removes handwritten JWT/session code, the temporary facade, credential fields from the former Vendor data, and transitional ownership columns only after the frontend cutover and migration audits pass.</w:t>
       </w:r>
     </w:p>
     <w:p>
@@ -7906,7 +7723,7 @@
           <w:color w:val="000000"/>
           <w:sz w:val="22"/>
         </w:rPr>
-        <w:t>PR 04 adds Portal, Organization Portal Subscription, Member Portal Access, primary Vendor Profile, subscription/access middleware, catalog ownership backfill, one-primary-profile enforcement, and migration verification reports.</w:t>
+        <w:t>PRs 09 through 11 finish the quick-create, product/version, catalog/template, universal-search, CSV, mobile, keyboard, focus, screen-reader, and responsive behavior already defined in this blueprint.</w:t>
       </w:r>
     </w:p>
     <w:p>
@@ -7922,87 +7739,7 @@
           <w:color w:val="000000"/>
           <w:sz w:val="22"/>
         </w:rPr>
-        <w:t>PRs 05 and 06 separately deliver the visible authentication/onboarding and member-access experiences. The Organization switcher appears only when a User has multiple memberships. Custom job roles remain deferred.</w:t>
-      </w:r>
-    </w:p>
-    <w:p>
-      <w:pPr>
-        <w:keepLines/>
-        <w:spacing w:before="0" w:after="160" w:line="276" w:lineRule="auto"/>
-      </w:pPr>
-      <w:r>
-        <w:rPr>
-          <w:rFonts w:ascii="Arial" w:hAnsi="Arial"/>
-          <w:b w:val="0"/>
-          <w:i w:val="0"/>
-          <w:color w:val="000000"/>
-          <w:sz w:val="22"/>
-        </w:rPr>
-        <w:t>PR 07 completes profile-scoped authorization across products, versions, categories, templates, and lifecycle actions, including system-record immutability, identifier uniqueness, and primary-version concurrency.</w:t>
-      </w:r>
-    </w:p>
-    <w:p>
-      <w:pPr>
-        <w:keepLines/>
-        <w:spacing w:before="0" w:after="160" w:line="276" w:lineRule="auto"/>
-      </w:pPr>
-      <w:r>
-        <w:rPr>
-          <w:rFonts w:ascii="Arial" w:hAnsi="Arial"/>
-          <w:b w:val="0"/>
-          <w:i w:val="0"/>
-          <w:color w:val="000000"/>
-          <w:sz w:val="22"/>
-        </w:rPr>
-        <w:t>PR 08 completes R2 upload/deletion/rollback tests, version-owned media behavior, CSV limits and row errors, profile-aware import/export, and universal-search isolation and the 10,000-product benchmark.</w:t>
-      </w:r>
-    </w:p>
-    <w:p>
-      <w:pPr>
-        <w:keepLines/>
-        <w:spacing w:before="0" w:after="160" w:line="276" w:lineRule="auto"/>
-      </w:pPr>
-      <w:r>
-        <w:rPr>
-          <w:rFonts w:ascii="Arial" w:hAnsi="Arial"/>
-          <w:b w:val="0"/>
-          <w:i w:val="0"/>
-          <w:color w:val="000000"/>
-          <w:sz w:val="22"/>
-        </w:rPr>
-        <w:t>PR 09 removes handwritten JWT/session code, the temporary facade, credential fields from the former Vendor data, and transitional ownership columns only after the frontend cutover and migration audits pass.</w:t>
-      </w:r>
-    </w:p>
-    <w:p>
-      <w:pPr>
-        <w:keepLines/>
-        <w:spacing w:before="0" w:after="160" w:line="276" w:lineRule="auto"/>
-      </w:pPr>
-      <w:r>
-        <w:rPr>
-          <w:rFonts w:ascii="Arial" w:hAnsi="Arial"/>
-          <w:b w:val="0"/>
-          <w:i w:val="0"/>
-          <w:color w:val="000000"/>
-          <w:sz w:val="22"/>
-        </w:rPr>
-        <w:t>PRs 10 through 12 finish the quick-create, product/version, catalog/template, universal-search, CSV, mobile, keyboard, focus, screen-reader, and responsive behavior already defined in this blueprint.</w:t>
-      </w:r>
-    </w:p>
-    <w:p>
-      <w:pPr>
-        <w:keepLines/>
-        <w:spacing w:before="0" w:after="160" w:line="276" w:lineRule="auto"/>
-      </w:pPr>
-      <w:r>
-        <w:rPr>
-          <w:rFonts w:ascii="Arial" w:hAnsi="Arial"/>
-          <w:b w:val="0"/>
-          <w:i w:val="0"/>
-          <w:color w:val="000000"/>
-          <w:sz w:val="22"/>
-        </w:rPr>
-        <w:t>PR 13 contains only clean-install and upgrade verification, release notes, security and license evidence, setup/migration/rollback documentation, final screenshots, and regenerated Markdown/DOCX artifacts.</w:t>
+        <w:t>PR 12 contains only clean-install and upgrade verification, release notes, security and license evidence, setup/migration/rollback documentation, final screenshots, and regenerated Markdown/DOCX artifacts.</w:t>
       </w:r>
     </w:p>
     <w:p>
@@ -8715,7 +8452,7 @@
           <w:color w:val="000000"/>
           <w:sz w:val="22"/>
         </w:rPr>
-        <w:t>This implementation run ends when PR 13 is merged and the repository is release-ready. It does not provision an external staging or production deployment.</w:t>
+        <w:t>This implementation run ends when PR 12 is merged and the repository is release-ready. It does not provision an external staging or production deployment.</w:t>
       </w:r>
     </w:p>
     <w:p>

</xml_diff>